<commit_message>
docs(paper): §2.4 add explicit Δ definition (simple arithmetic mean diff)
Define Δ = mean(group_B) − mean(group_A), each group mean = unweighted average
of 45 per-paper GPT-judge scores. Explicitly state that no covariates, random
effects, weighting, or shrinkage were applied, and that no L9 main-effect
decomposition, least-squares means, or mixed-effects modelling was used.
Pre-empts reviewer questions about which estimator was actually used.
</commit_message>
<xml_diff>
--- a/paper/manuscript_v2_zh_CCLM.docx
+++ b/paper/manuscript_v2_zh_CCLM.docx
@@ -1528,7 +1528,23 @@
           <w:b w:val="0"/>
           <w:sz w:val="22"/>
         </w:rPr>
-        <w:t>组间成对比较采用双侧 Mann-Whitney U 检验（scipy.stats.mannwhitneyu），针对 per-paper GPT 评审评分（每组 n=45，对应 15 任务 × 3 重复）；四因子消融的多重比较采用 Bonferroni 校正。4 个配置成分效应以靶向配置对的均值差量化，遵循正交替换设计：规则 = E_rules_v2 vs A_bare；骨架 = H4_sop_only vs E_rules_v2；详细内容 = G_template_rules vs H3_skeleton；示例 = H2_keep_examples vs G_template_rules。评分者间一致性采用 Pearson 相关系数、Spearman 相关系数以及 Shrout 与 Fleiss [13] 定义的 ICC(2,1)（绝对一致）与 ICC(3,1)（排序一致）评价。ICC 计算采用 pingouin 0.5 Python 库。自评偏差采用跨模型差分定量，即 bias = (own-own 均值) − (cross-own 均值)。</w:t>
+        <w:t>组间成对比较采用双侧 Mann-Whitney U 检验（scipy.stats.mannwhitneyu），针对 per-paper GPT 评审评分（每组 n=45，对应 15 任务 × 3 重复）；四因子消融的多重比较采用 Bonferroni 校正。4 个配置成分效应在正交替换设计下采用靶向配置对计算：规则 = E_rules_v2 vs A_bare；骨架 = H4_sop_only vs E_rules_v2；详细内容 = G_template_rules vs H3_skeleton；示例 = H2_keep_examples vs G_template_rules。每个效应 Δ 定义为</w:t>
+      </w:r>
+      <w:r>
+        <w:rPr>
+          <w:rFonts w:ascii="Times New Roman" w:hAnsi="Times New Roman" w:eastAsia="宋体"/>
+          <w:b/>
+          <w:sz w:val="22"/>
+        </w:rPr>
+        <w:t>简单算术均值差</w:t>
+      </w:r>
+      <w:r>
+        <w:rPr>
+          <w:rFonts w:ascii="Times New Roman" w:hAnsi="Times New Roman" w:eastAsia="宋体"/>
+          <w:b w:val="0"/>
+          <w:sz w:val="22"/>
+        </w:rPr>
+        <w:t>：Δ = mean(组 B) − mean(组 A)，其中各组均值为该配置下 45 条 per-paper GPT 评审评分的非加权算术平均；未加入任何协变量、随机效应、加权或收缩。同样的每组 45 个样本同时用作对应 Mann-Whitney U 检验的输入。本研究未采用 L9 正交表主效应估计、最小二乘均值（least-squares means）或混合效应（mixed-effects）模型。评分者间一致性采用 Pearson 相关系数、Spearman 相关系数以及 Shrout 与 Fleiss [13] 定义的 ICC(2,1)（绝对一致）与 ICC(3,1)（排序一致）评价。ICC 计算采用 pingouin 0.5 Python 库。自评偏差采用跨模型差分定量，即 bias = (own-own 均值) − (cross-own 均值)。</w:t>
       </w:r>
     </w:p>
     <w:p>

</xml_diff>